<commit_message>
Nombre del archivo corregido
</commit_message>
<xml_diff>
--- a/Preparation outline.docx
+++ b/Preparation outline.docx
@@ -13,6 +13,12 @@
           <w:lang w:val="es-AR"/>
         </w:rPr>
         <w:t>DCSDASDS</w:t>
+      </w:r>
+      <w:r>
+        <w:rPr>
+          <w:lang w:val="es-AR"/>
+        </w:rPr>
+        <w:t>dasd</w:t>
       </w:r>
     </w:p>
     <w:sectPr>

</xml_diff>